<commit_message>
Rebuild Figure 1 and the docx pair that embedded the stale copy
Figure 1 regenerated with the anchor-label and inset fixes (labels moved right
of their markers with vertical de-collision and leader lines; stray inset tick
labels removed). Source change is in EnergeticDiffusion2/plot_novelty_scatter.py.

Also rebuilt scireports_paper.docx and scireports_paper_SI.docx. Word embeds a
copy of each image at build time, so the previously-built docx still carried the
old overlapping figure even after the PNG on disk was updated - verified by
md5-matching the embedded media against paper/figs/novelty_vs_D.png (was
268,060 B stale, now matches the current 264,568 B render). Re-verified after
rebuild: 5 figures, 3 tables, embedded Figure 1 identical to the file on disk.

Co-Authored-By: Claude Opus 4.8 <noreply@anthropic.com>
</commit_message>
<xml_diff>
--- a/paper/scientific_reports/scireports_paper.docx
+++ b/paper/scientific_reports/scireports_paper.docx
@@ -5479,7 +5479,7 @@
         <w:widowControl w:val="1"/>
       </w:pPr>
       <w:r>
-        <w:t xml:space="preserve">†E2 D and P are flagged: OB = +28.9 % exceeds the +25 % K-J reliability limit; these values are upper-bound estimates only (see Section 2.4 E2 audit). E9 K-J is undefined (OB &lt; −200 %).</w:t>
+        <w:t xml:space="preserve">†E2 D and P are flagged: OB = +28.9 % exceeds the +25 % K-J reliability limit; these values are upper-bound estimates only. E9 K-J is undefined (OB &lt; −200 %).</w:t>
       </w:r>
     </w:p>
     <w:p>
@@ -10396,7 +10396,7 @@
         <w:t xml:space="preserve"> </w:t>
       </w:r>
       <w:r>
-        <w:t xml:space="preserve">requires a thermochemical-equilibrium solver, Section 3.)</w:t>
+        <w:t xml:space="preserve">requires a thermochemical-equilibrium solver, see Limitations above.)</w:t>
       </w:r>
     </w:p>
     <w:p>
@@ -10453,7 +10453,7 @@
         <w:t xml:space="preserve"> </w:t>
       </w:r>
       <w:r>
-        <w:t xml:space="preserve">comes from a scaffold family disjoint from L1; its recovery validates the sampler's scaffold reach rather than adding a novel lead, and its calibrated D is an upper bound pending thermal stability confirmation and a 1,2,3,5-oxatriazole-class DFT anchor (Section 3).</w:t>
+        <w:t xml:space="preserve">comes from a scaffold family disjoint from L1; its recovery validates the sampler's scaffold reach rather than adding a novel lead, and its calibrated D is an upper bound pending thermal stability confirmation and a 1,2,3,5-oxatriazole-class DFT anchor (see Limitations above).</w:t>
       </w:r>
     </w:p>
     <w:p>
@@ -10526,7 +10526,7 @@
         <w:t xml:space="preserve"> </w:t>
       </w:r>
       <w:r>
-        <w:t xml:space="preserve">primary-explosive sensitivity flag), and DFT confirms a real local minimum. Polymorph screening and crystal-density refinement (Section 3) are required before any density-derived performance claim can be considered quantitative.</w:t>
+        <w:t xml:space="preserve">primary-explosive sensitivity flag), and DFT confirms a real local minimum. Polymorph screening and crystal-density refinement (see Limitations above) are required before any density-derived performance claim can be considered quantitative.</w:t>
       </w:r>
     </w:p>
     <w:p>

</xml_diff>